<commit_message>
updated index, uploaded white paper
</commit_message>
<xml_diff>
--- a/case-study-articles/Explain_My_Pain_White_Paper.docx
+++ b/case-study-articles/Explain_My_Pain_White_Paper.docx
@@ -1,6 +1,6 @@
 
 <file path=word/document.xml><?xml version="1.0" encoding="utf-8"?>
-<w:document xmlns:wpc="http://schemas.microsoft.com/office/word/2010/wordprocessingCanvas" xmlns:cx="http://schemas.microsoft.com/office/drawing/2014/chartex" xmlns:cx1="http://schemas.microsoft.com/office/drawing/2015/9/8/chartex" xmlns:cx2="http://schemas.microsoft.com/office/drawing/2015/10/21/chartex" xmlns:cx3="http://schemas.microsoft.com/office/drawing/2016/5/9/chartex" xmlns:cx4="http://schemas.microsoft.com/office/drawing/2016/5/10/chartex" xmlns:cx5="http://schemas.microsoft.com/office/drawing/2016/5/11/chartex" xmlns:cx6="http://schemas.microsoft.com/office/drawing/2016/5/12/chartex" xmlns:cx7="http://schemas.microsoft.com/office/drawing/2016/5/13/chartex" xmlns:cx8="http://schemas.microsoft.com/office/drawing/2016/5/14/chartex" xmlns:mc="http://schemas.openxmlformats.org/markup-compatibility/2006" xmlns:aink="http://schemas.microsoft.com/office/drawing/2016/ink" xmlns:am3d="http://schemas.microsoft.com/office/drawing/2017/model3d" xmlns:o="urn:schemas-microsoft-com:office:office" xmlns:oel="http://schemas.microsoft.com/office/2019/extlst" xmlns:r="http://schemas.openxmlformats.org/officeDocument/2006/relationships" xmlns:m="http://schemas.openxmlformats.org/officeDocument/2006/math" xmlns:v="urn:schemas-microsoft-com:vml" xmlns:wp14="http://schemas.microsoft.com/office/word/2010/wordprocessingDrawing" xmlns:wp="http://schemas.openxmlformats.org/drawingml/2006/wordprocessingDrawing" xmlns:w10="urn:schemas-microsoft-com:office:word" xmlns:w="http://schemas.openxmlformats.org/wordprocessingml/2006/main" xmlns:w14="http://schemas.microsoft.com/office/word/2010/wordml" xmlns:w15="http://schemas.microsoft.com/office/word/2012/wordml" xmlns:w16cex="http://schemas.microsoft.com/office/word/2018/wordml/cex" xmlns:w16cid="http://schemas.microsoft.com/office/word/2016/wordml/cid" xmlns:w16="http://schemas.microsoft.com/office/word/2018/wordml" xmlns:w16du="http://schemas.microsoft.com/office/word/2023/wordml/word16du" xmlns:w16sdtdh="http://schemas.microsoft.com/office/word/2020/wordml/sdtdatahash" xmlns:w16sdtfl="http://schemas.microsoft.com/office/word/2024/wordml/sdtformatlock" xmlns:w16se="http://schemas.microsoft.com/office/word/2015/wordml/symex" xmlns:wpg="http://schemas.microsoft.com/office/word/2010/wordprocessingGroup" xmlns:wpi="http://schemas.microsoft.com/office/word/2010/wordprocessingInk" xmlns:wne="http://schemas.microsoft.com/office/word/2006/wordml" xmlns:wps="http://schemas.microsoft.com/office/word/2010/wordprocessingShape" mc:Ignorable="w14 w15 w16se w16cid w16 w16cex w16sdtdh w16sdtfl w16du wp14">
+<w:document xmlns:wpc="http://schemas.microsoft.com/office/word/2010/wordprocessingCanvas" xmlns:cx="http://schemas.microsoft.com/office/drawing/2014/chartex" xmlns:cx1="http://schemas.microsoft.com/office/drawing/2015/9/8/chartex" xmlns:cx2="http://schemas.microsoft.com/office/drawing/2015/10/21/chartex" xmlns:cx3="http://schemas.microsoft.com/office/drawing/2016/5/9/chartex" xmlns:cx4="http://schemas.microsoft.com/office/drawing/2016/5/10/chartex" xmlns:cx5="http://schemas.microsoft.com/office/drawing/2016/5/11/chartex" xmlns:cx6="http://schemas.microsoft.com/office/drawing/2016/5/12/chartex" xmlns:cx7="http://schemas.microsoft.com/office/drawing/2016/5/13/chartex" xmlns:cx8="http://schemas.microsoft.com/office/drawing/2016/5/14/chartex" xmlns:mc="http://schemas.openxmlformats.org/markup-compatibility/2006" xmlns:m="http://schemas.openxmlformats.org/officeDocument/2006/math" xmlns:aink="http://schemas.microsoft.com/office/drawing/2016/ink" xmlns:am3d="http://schemas.microsoft.com/office/drawing/2017/model3d" xmlns:oel="http://schemas.microsoft.com/office/2019/extlst" xmlns:r="http://schemas.openxmlformats.org/officeDocument/2006/relationships" xmlns:wp14="http://schemas.microsoft.com/office/word/2010/wordprocessingDrawing" xmlns:wp="http://schemas.openxmlformats.org/drawingml/2006/wordprocessingDrawing" xmlns:wpg="http://schemas.microsoft.com/office/word/2010/wordprocessingGroup" xmlns:wpi="http://schemas.microsoft.com/office/word/2010/wordprocessingInk" xmlns:wps="http://schemas.microsoft.com/office/word/2010/wordprocessingShape" xmlns:o="urn:schemas-microsoft-com:office:office" xmlns:v="urn:schemas-microsoft-com:vml" xmlns:w10="urn:schemas-microsoft-com:office:word" xmlns:w="http://schemas.openxmlformats.org/wordprocessingml/2006/main" xmlns:w14="http://schemas.microsoft.com/office/word/2010/wordml" xmlns:w15="http://schemas.microsoft.com/office/word/2012/wordml" xmlns:w16cex="http://schemas.microsoft.com/office/word/2018/wordml/cex" xmlns:w16cid="http://schemas.microsoft.com/office/word/2016/wordml/cid" xmlns:w16="http://schemas.microsoft.com/office/word/2018/wordml" xmlns:w16sdtdh="http://schemas.microsoft.com/office/word/2020/wordml/sdtdatahash" xmlns:w16sdtfl="http://schemas.microsoft.com/office/word/2024/wordml/sdtformatlock" xmlns:w16se="http://schemas.microsoft.com/office/word/2015/wordml/symex" xmlns:w16du="http://schemas.microsoft.com/office/word/2023/wordml/word16du" xmlns:wne="http://schemas.microsoft.com/office/word/2006/wordml" mc:Ignorable="w14 w15 w16se w16cid w16 w16cex w16sdtdh w16sdtfl w16du wp14">
   <w:body>
     <w:p>
       <w:pPr>
@@ -1329,7 +1329,7 @@
           <w:color w:val="000000" w:themeColor="text1"/>
         </w:rPr>
         <w:drawing>
-          <wp:inline distT="0" distB="0" distL="0" distR="0">
+          <wp:inline distT="0" distB="0" distL="0" distR="0" wp14:anchorId="3CCAA894" wp14:editId="45B20736">
             <wp:extent cx="5485180" cy="996846"/>
             <wp:effectExtent l="0" t="0" r="1270" b="0"/>
             <wp:docPr id="1620921870" name="Picture 1"/>
@@ -1575,7 +1575,7 @@
           <w:color w:val="000000" w:themeColor="text1"/>
         </w:rPr>
         <w:drawing>
-          <wp:inline distT="0" distB="0" distL="0" distR="0">
+          <wp:inline distT="0" distB="0" distL="0" distR="0" wp14:anchorId="59CB8D77" wp14:editId="70FEE8D1">
             <wp:extent cx="3237876" cy="2908842"/>
             <wp:effectExtent l="0" t="0" r="635" b="0"/>
             <wp:docPr id="875487411" name="Picture 1"/>
@@ -5615,7 +5615,7 @@
           <w:color w:val="000000" w:themeColor="text1"/>
         </w:rPr>
         <w:lastRenderedPageBreak/>
-        <w:t>About the Author and Sierra Codes</w:t>
+        <w:t xml:space="preserve">About the Author </w:t>
       </w:r>
     </w:p>
     <w:p>
@@ -5646,24 +5646,21 @@
           <w:rFonts w:asciiTheme="majorHAnsi" w:hAnsiTheme="majorHAnsi" w:cstheme="majorHAnsi"/>
           <w:color w:val="000000" w:themeColor="text1"/>
         </w:rPr>
-        <w:t xml:space="preserve"> at Lancaster University (UK), she founded </w:t>
-      </w:r>
-      <w:r>
-        <w:rPr>
-          <w:rStyle w:val="Strong"/>
-          <w:rFonts w:asciiTheme="majorHAnsi" w:hAnsiTheme="majorHAnsi" w:cstheme="majorHAnsi"/>
-          <w:b w:val="0"/>
-          <w:bCs w:val="0"/>
-          <w:color w:val="000000" w:themeColor="text1"/>
-        </w:rPr>
-        <w:t>Sierra Codes</w:t>
-      </w:r>
-      <w:r>
-        <w:rPr>
-          <w:rFonts w:asciiTheme="majorHAnsi" w:hAnsiTheme="majorHAnsi" w:cstheme="majorHAnsi"/>
-          <w:color w:val="000000" w:themeColor="text1"/>
-        </w:rPr>
-        <w:t>, a bilingual research and development studio based in Argentina that bridges linguistics, data, and design.</w:t>
+        <w:t xml:space="preserve"> at Lancaster University (UK), she </w:t>
+      </w:r>
+      <w:r>
+        <w:rPr>
+          <w:rFonts w:asciiTheme="majorHAnsi" w:hAnsiTheme="majorHAnsi" w:cstheme="majorHAnsi"/>
+          <w:color w:val="000000" w:themeColor="text1"/>
+        </w:rPr>
+        <w:t>worked as a senior lecturer and researcher at Manchester Metropolitan University for 15 years. Upon leaving academia, and the UK, she created</w:t>
+      </w:r>
+      <w:r>
+        <w:rPr>
+          <w:rFonts w:asciiTheme="majorHAnsi" w:hAnsiTheme="majorHAnsi" w:cstheme="majorHAnsi"/>
+          <w:color w:val="000000" w:themeColor="text1"/>
+        </w:rPr>
+        <w:t xml:space="preserve"> a bilingual research and development studio based in Argentina that bridges linguistics, data, and design.</w:t>
       </w:r>
     </w:p>
     <w:p>
@@ -5680,7 +5677,14 @@
           <w:rFonts w:asciiTheme="majorHAnsi" w:hAnsiTheme="majorHAnsi" w:cstheme="majorHAnsi"/>
           <w:color w:val="000000" w:themeColor="text1"/>
         </w:rPr>
-        <w:t>Sierra Codes develops ethically grounded, human-centred digital tools that transform language research into structured insight. Its projects draw on academic research in metaphor and health communication to create transparent, explainable NLP solutions for health, education, and wellbeing. Stella also works as a freelance annotation and evaluation specialist, contributing to international NLP and AI projects focused on data quality and interpretability.</w:t>
+        <w:t>Stella Bullo</w:t>
+      </w:r>
+      <w:r>
+        <w:rPr>
+          <w:rFonts w:asciiTheme="majorHAnsi" w:hAnsiTheme="majorHAnsi" w:cstheme="majorHAnsi"/>
+          <w:color w:val="000000" w:themeColor="text1"/>
+        </w:rPr>
+        <w:t xml:space="preserve"> develops ethically grounded, human-centred digital tools that transform language research into structured insight. Its projects draw on academic research in metaphor and health communication to create transparent, explainable NLP solutions for health, education, and wellbeing. Stella also works as a freelance annotation and evaluation specialist, contributing to international NLP and AI projects focused on data quality and interpretability.</w:t>
       </w:r>
     </w:p>
     <w:p>
@@ -5799,7 +5803,7 @@
           <w:rFonts w:asciiTheme="majorHAnsi" w:hAnsiTheme="majorHAnsi" w:cstheme="majorHAnsi"/>
           <w:color w:val="000000" w:themeColor="text1"/>
         </w:rPr>
-        <w:t xml:space="preserve">Stella Bullo, PhD </w:t>
+        <w:t xml:space="preserve">Stella Bullo </w:t>
       </w:r>
       <w:r>
         <w:rPr>
@@ -5823,7 +5827,7 @@
           <w:rFonts w:asciiTheme="majorHAnsi" w:hAnsiTheme="majorHAnsi" w:cstheme="majorHAnsi"/>
           <w:color w:val="000000" w:themeColor="text1"/>
         </w:rPr>
-        <w:t xml:space="preserve">Sierra Codes 2025 </w:t>
+        <w:t xml:space="preserve">2025 </w:t>
       </w:r>
     </w:p>
     <w:p>
@@ -5908,14 +5912,13 @@
           <w:color w:val="000000" w:themeColor="text1"/>
         </w:rPr>
       </w:pPr>
-      <w:hyperlink r:id="rId14" w:tgtFrame="_new" w:history="1">
+      <w:hyperlink r:id="rId14" w:history="1">
         <w:r>
           <w:rPr>
             <w:rStyle w:val="Hyperlink"/>
             <w:rFonts w:asciiTheme="majorHAnsi" w:hAnsiTheme="majorHAnsi" w:cstheme="majorHAnsi"/>
-            <w:color w:val="000000" w:themeColor="text1"/>
           </w:rPr>
-          <w:t>https://sierracodes.netlify.app</w:t>
+          <w:t>https://stellabullo.com</w:t>
         </w:r>
       </w:hyperlink>
     </w:p>
@@ -5995,7 +5998,7 @@
 </file>
 
 <file path=word/endnotes.xml><?xml version="1.0" encoding="utf-8"?>
-<w:endnotes xmlns:wpc="http://schemas.microsoft.com/office/word/2010/wordprocessingCanvas" xmlns:cx="http://schemas.microsoft.com/office/drawing/2014/chartex" xmlns:cx1="http://schemas.microsoft.com/office/drawing/2015/9/8/chartex" xmlns:cx2="http://schemas.microsoft.com/office/drawing/2015/10/21/chartex" xmlns:cx3="http://schemas.microsoft.com/office/drawing/2016/5/9/chartex" xmlns:cx4="http://schemas.microsoft.com/office/drawing/2016/5/10/chartex" xmlns:cx5="http://schemas.microsoft.com/office/drawing/2016/5/11/chartex" xmlns:cx6="http://schemas.microsoft.com/office/drawing/2016/5/12/chartex" xmlns:cx7="http://schemas.microsoft.com/office/drawing/2016/5/13/chartex" xmlns:cx8="http://schemas.microsoft.com/office/drawing/2016/5/14/chartex" xmlns:mc="http://schemas.openxmlformats.org/markup-compatibility/2006" xmlns:aink="http://schemas.microsoft.com/office/drawing/2016/ink" xmlns:am3d="http://schemas.microsoft.com/office/drawing/2017/model3d" xmlns:o="urn:schemas-microsoft-com:office:office" xmlns:oel="http://schemas.microsoft.com/office/2019/extlst" xmlns:r="http://schemas.openxmlformats.org/officeDocument/2006/relationships" xmlns:m="http://schemas.openxmlformats.org/officeDocument/2006/math" xmlns:v="urn:schemas-microsoft-com:vml" xmlns:wp14="http://schemas.microsoft.com/office/word/2010/wordprocessingDrawing" xmlns:wp="http://schemas.openxmlformats.org/drawingml/2006/wordprocessingDrawing" xmlns:w10="urn:schemas-microsoft-com:office:word" xmlns:w="http://schemas.openxmlformats.org/wordprocessingml/2006/main" xmlns:w14="http://schemas.microsoft.com/office/word/2010/wordml" xmlns:w15="http://schemas.microsoft.com/office/word/2012/wordml" xmlns:w16cex="http://schemas.microsoft.com/office/word/2018/wordml/cex" xmlns:w16cid="http://schemas.microsoft.com/office/word/2016/wordml/cid" xmlns:w16="http://schemas.microsoft.com/office/word/2018/wordml" xmlns:w16du="http://schemas.microsoft.com/office/word/2023/wordml/word16du" xmlns:w16sdtdh="http://schemas.microsoft.com/office/word/2020/wordml/sdtdatahash" xmlns:w16sdtfl="http://schemas.microsoft.com/office/word/2024/wordml/sdtformatlock" xmlns:w16se="http://schemas.microsoft.com/office/word/2015/wordml/symex" xmlns:wpg="http://schemas.microsoft.com/office/word/2010/wordprocessingGroup" xmlns:wpi="http://schemas.microsoft.com/office/word/2010/wordprocessingInk" xmlns:wne="http://schemas.microsoft.com/office/word/2006/wordml" xmlns:wps="http://schemas.microsoft.com/office/word/2010/wordprocessingShape" mc:Ignorable="w14 w15 w16se w16cid w16 w16cex w16sdtdh w16sdtfl w16du wp14">
+<w:endnotes xmlns:wpc="http://schemas.microsoft.com/office/word/2010/wordprocessingCanvas" xmlns:cx="http://schemas.microsoft.com/office/drawing/2014/chartex" xmlns:cx1="http://schemas.microsoft.com/office/drawing/2015/9/8/chartex" xmlns:cx2="http://schemas.microsoft.com/office/drawing/2015/10/21/chartex" xmlns:cx3="http://schemas.microsoft.com/office/drawing/2016/5/9/chartex" xmlns:cx4="http://schemas.microsoft.com/office/drawing/2016/5/10/chartex" xmlns:cx5="http://schemas.microsoft.com/office/drawing/2016/5/11/chartex" xmlns:cx6="http://schemas.microsoft.com/office/drawing/2016/5/12/chartex" xmlns:cx7="http://schemas.microsoft.com/office/drawing/2016/5/13/chartex" xmlns:cx8="http://schemas.microsoft.com/office/drawing/2016/5/14/chartex" xmlns:mc="http://schemas.openxmlformats.org/markup-compatibility/2006" xmlns:m="http://schemas.openxmlformats.org/officeDocument/2006/math" xmlns:aink="http://schemas.microsoft.com/office/drawing/2016/ink" xmlns:am3d="http://schemas.microsoft.com/office/drawing/2017/model3d" xmlns:oel="http://schemas.microsoft.com/office/2019/extlst" xmlns:r="http://schemas.openxmlformats.org/officeDocument/2006/relationships" xmlns:wp14="http://schemas.microsoft.com/office/word/2010/wordprocessingDrawing" xmlns:wp="http://schemas.openxmlformats.org/drawingml/2006/wordprocessingDrawing" xmlns:wpg="http://schemas.microsoft.com/office/word/2010/wordprocessingGroup" xmlns:wpi="http://schemas.microsoft.com/office/word/2010/wordprocessingInk" xmlns:wps="http://schemas.microsoft.com/office/word/2010/wordprocessingShape" xmlns:o="urn:schemas-microsoft-com:office:office" xmlns:v="urn:schemas-microsoft-com:vml" xmlns:w10="urn:schemas-microsoft-com:office:word" xmlns:w="http://schemas.openxmlformats.org/wordprocessingml/2006/main" xmlns:w14="http://schemas.microsoft.com/office/word/2010/wordml" xmlns:w15="http://schemas.microsoft.com/office/word/2012/wordml" xmlns:w16cex="http://schemas.microsoft.com/office/word/2018/wordml/cex" xmlns:w16cid="http://schemas.microsoft.com/office/word/2016/wordml/cid" xmlns:w16="http://schemas.microsoft.com/office/word/2018/wordml" xmlns:w16sdtdh="http://schemas.microsoft.com/office/word/2020/wordml/sdtdatahash" xmlns:w16sdtfl="http://schemas.microsoft.com/office/word/2024/wordml/sdtformatlock" xmlns:w16se="http://schemas.microsoft.com/office/word/2015/wordml/symex" xmlns:w16du="http://schemas.microsoft.com/office/word/2023/wordml/word16du" xmlns:wne="http://schemas.microsoft.com/office/word/2006/wordml" mc:Ignorable="w14 w15 w16se w16cid w16 w16cex w16sdtdh w16sdtfl w16du wp14">
   <w:endnote w:type="separator" w:id="-1">
     <w:p>
       <w:r>
@@ -6014,7 +6017,7 @@
 </file>
 
 <file path=word/footer1.xml><?xml version="1.0" encoding="utf-8"?>
-<w:ftr xmlns:wpc="http://schemas.microsoft.com/office/word/2010/wordprocessingCanvas" xmlns:cx="http://schemas.microsoft.com/office/drawing/2014/chartex" xmlns:cx1="http://schemas.microsoft.com/office/drawing/2015/9/8/chartex" xmlns:cx2="http://schemas.microsoft.com/office/drawing/2015/10/21/chartex" xmlns:cx3="http://schemas.microsoft.com/office/drawing/2016/5/9/chartex" xmlns:cx4="http://schemas.microsoft.com/office/drawing/2016/5/10/chartex" xmlns:cx5="http://schemas.microsoft.com/office/drawing/2016/5/11/chartex" xmlns:cx6="http://schemas.microsoft.com/office/drawing/2016/5/12/chartex" xmlns:cx7="http://schemas.microsoft.com/office/drawing/2016/5/13/chartex" xmlns:cx8="http://schemas.microsoft.com/office/drawing/2016/5/14/chartex" xmlns:mc="http://schemas.openxmlformats.org/markup-compatibility/2006" xmlns:aink="http://schemas.microsoft.com/office/drawing/2016/ink" xmlns:am3d="http://schemas.microsoft.com/office/drawing/2017/model3d" xmlns:o="urn:schemas-microsoft-com:office:office" xmlns:oel="http://schemas.microsoft.com/office/2019/extlst" xmlns:r="http://schemas.openxmlformats.org/officeDocument/2006/relationships" xmlns:m="http://schemas.openxmlformats.org/officeDocument/2006/math" xmlns:v="urn:schemas-microsoft-com:vml" xmlns:wp14="http://schemas.microsoft.com/office/word/2010/wordprocessingDrawing" xmlns:wp="http://schemas.openxmlformats.org/drawingml/2006/wordprocessingDrawing" xmlns:w10="urn:schemas-microsoft-com:office:word" xmlns:w="http://schemas.openxmlformats.org/wordprocessingml/2006/main" xmlns:w14="http://schemas.microsoft.com/office/word/2010/wordml" xmlns:w15="http://schemas.microsoft.com/office/word/2012/wordml" xmlns:w16cex="http://schemas.microsoft.com/office/word/2018/wordml/cex" xmlns:w16cid="http://schemas.microsoft.com/office/word/2016/wordml/cid" xmlns:w16="http://schemas.microsoft.com/office/word/2018/wordml" xmlns:w16du="http://schemas.microsoft.com/office/word/2023/wordml/word16du" xmlns:w16sdtdh="http://schemas.microsoft.com/office/word/2020/wordml/sdtdatahash" xmlns:w16sdtfl="http://schemas.microsoft.com/office/word/2024/wordml/sdtformatlock" xmlns:w16se="http://schemas.microsoft.com/office/word/2015/wordml/symex" xmlns:wpg="http://schemas.microsoft.com/office/word/2010/wordprocessingGroup" xmlns:wpi="http://schemas.microsoft.com/office/word/2010/wordprocessingInk" xmlns:wne="http://schemas.microsoft.com/office/word/2006/wordml" xmlns:wps="http://schemas.microsoft.com/office/word/2010/wordprocessingShape" mc:Ignorable="w14 w15 w16se w16cid w16 w16cex w16sdtdh w16sdtfl w16du wp14">
+<w:ftr xmlns:wpc="http://schemas.microsoft.com/office/word/2010/wordprocessingCanvas" xmlns:cx="http://schemas.microsoft.com/office/drawing/2014/chartex" xmlns:cx1="http://schemas.microsoft.com/office/drawing/2015/9/8/chartex" xmlns:cx2="http://schemas.microsoft.com/office/drawing/2015/10/21/chartex" xmlns:cx3="http://schemas.microsoft.com/office/drawing/2016/5/9/chartex" xmlns:cx4="http://schemas.microsoft.com/office/drawing/2016/5/10/chartex" xmlns:cx5="http://schemas.microsoft.com/office/drawing/2016/5/11/chartex" xmlns:cx6="http://schemas.microsoft.com/office/drawing/2016/5/12/chartex" xmlns:cx7="http://schemas.microsoft.com/office/drawing/2016/5/13/chartex" xmlns:cx8="http://schemas.microsoft.com/office/drawing/2016/5/14/chartex" xmlns:mc="http://schemas.openxmlformats.org/markup-compatibility/2006" xmlns:m="http://schemas.openxmlformats.org/officeDocument/2006/math" xmlns:aink="http://schemas.microsoft.com/office/drawing/2016/ink" xmlns:am3d="http://schemas.microsoft.com/office/drawing/2017/model3d" xmlns:oel="http://schemas.microsoft.com/office/2019/extlst" xmlns:r="http://schemas.openxmlformats.org/officeDocument/2006/relationships" xmlns:wp14="http://schemas.microsoft.com/office/word/2010/wordprocessingDrawing" xmlns:wp="http://schemas.openxmlformats.org/drawingml/2006/wordprocessingDrawing" xmlns:wpg="http://schemas.microsoft.com/office/word/2010/wordprocessingGroup" xmlns:wpi="http://schemas.microsoft.com/office/word/2010/wordprocessingInk" xmlns:wps="http://schemas.microsoft.com/office/word/2010/wordprocessingShape" xmlns:o="urn:schemas-microsoft-com:office:office" xmlns:v="urn:schemas-microsoft-com:vml" xmlns:w10="urn:schemas-microsoft-com:office:word" xmlns:w="http://schemas.openxmlformats.org/wordprocessingml/2006/main" xmlns:w14="http://schemas.microsoft.com/office/word/2010/wordml" xmlns:w15="http://schemas.microsoft.com/office/word/2012/wordml" xmlns:w16cex="http://schemas.microsoft.com/office/word/2018/wordml/cex" xmlns:w16cid="http://schemas.microsoft.com/office/word/2016/wordml/cid" xmlns:w16="http://schemas.microsoft.com/office/word/2018/wordml" xmlns:w16sdtdh="http://schemas.microsoft.com/office/word/2020/wordml/sdtdatahash" xmlns:w16sdtfl="http://schemas.microsoft.com/office/word/2024/wordml/sdtformatlock" xmlns:w16se="http://schemas.microsoft.com/office/word/2015/wordml/symex" xmlns:w16du="http://schemas.microsoft.com/office/word/2023/wordml/word16du" xmlns:wne="http://schemas.microsoft.com/office/word/2006/wordml" mc:Ignorable="w14 w15 w16se w16cid w16 w16cex w16sdtdh w16sdtfl w16du wp14">
   <w:sdt>
     <w:sdtPr>
       <w:rPr>
@@ -6072,7 +6075,7 @@
 </file>
 
 <file path=word/footer2.xml><?xml version="1.0" encoding="utf-8"?>
-<w:ftr xmlns:wpc="http://schemas.microsoft.com/office/word/2010/wordprocessingCanvas" xmlns:cx="http://schemas.microsoft.com/office/drawing/2014/chartex" xmlns:cx1="http://schemas.microsoft.com/office/drawing/2015/9/8/chartex" xmlns:cx2="http://schemas.microsoft.com/office/drawing/2015/10/21/chartex" xmlns:cx3="http://schemas.microsoft.com/office/drawing/2016/5/9/chartex" xmlns:cx4="http://schemas.microsoft.com/office/drawing/2016/5/10/chartex" xmlns:cx5="http://schemas.microsoft.com/office/drawing/2016/5/11/chartex" xmlns:cx6="http://schemas.microsoft.com/office/drawing/2016/5/12/chartex" xmlns:cx7="http://schemas.microsoft.com/office/drawing/2016/5/13/chartex" xmlns:cx8="http://schemas.microsoft.com/office/drawing/2016/5/14/chartex" xmlns:mc="http://schemas.openxmlformats.org/markup-compatibility/2006" xmlns:aink="http://schemas.microsoft.com/office/drawing/2016/ink" xmlns:am3d="http://schemas.microsoft.com/office/drawing/2017/model3d" xmlns:o="urn:schemas-microsoft-com:office:office" xmlns:oel="http://schemas.microsoft.com/office/2019/extlst" xmlns:r="http://schemas.openxmlformats.org/officeDocument/2006/relationships" xmlns:m="http://schemas.openxmlformats.org/officeDocument/2006/math" xmlns:v="urn:schemas-microsoft-com:vml" xmlns:wp14="http://schemas.microsoft.com/office/word/2010/wordprocessingDrawing" xmlns:wp="http://schemas.openxmlformats.org/drawingml/2006/wordprocessingDrawing" xmlns:w10="urn:schemas-microsoft-com:office:word" xmlns:w="http://schemas.openxmlformats.org/wordprocessingml/2006/main" xmlns:w14="http://schemas.microsoft.com/office/word/2010/wordml" xmlns:w15="http://schemas.microsoft.com/office/word/2012/wordml" xmlns:w16cex="http://schemas.microsoft.com/office/word/2018/wordml/cex" xmlns:w16cid="http://schemas.microsoft.com/office/word/2016/wordml/cid" xmlns:w16="http://schemas.microsoft.com/office/word/2018/wordml" xmlns:w16du="http://schemas.microsoft.com/office/word/2023/wordml/word16du" xmlns:w16sdtdh="http://schemas.microsoft.com/office/word/2020/wordml/sdtdatahash" xmlns:w16sdtfl="http://schemas.microsoft.com/office/word/2024/wordml/sdtformatlock" xmlns:w16se="http://schemas.microsoft.com/office/word/2015/wordml/symex" xmlns:wpg="http://schemas.microsoft.com/office/word/2010/wordprocessingGroup" xmlns:wpi="http://schemas.microsoft.com/office/word/2010/wordprocessingInk" xmlns:wne="http://schemas.microsoft.com/office/word/2006/wordml" xmlns:wps="http://schemas.microsoft.com/office/word/2010/wordprocessingShape" mc:Ignorable="w14 w15 w16se w16cid w16 w16cex w16sdtdh w16sdtfl w16du wp14">
+<w:ftr xmlns:wpc="http://schemas.microsoft.com/office/word/2010/wordprocessingCanvas" xmlns:cx="http://schemas.microsoft.com/office/drawing/2014/chartex" xmlns:cx1="http://schemas.microsoft.com/office/drawing/2015/9/8/chartex" xmlns:cx2="http://schemas.microsoft.com/office/drawing/2015/10/21/chartex" xmlns:cx3="http://schemas.microsoft.com/office/drawing/2016/5/9/chartex" xmlns:cx4="http://schemas.microsoft.com/office/drawing/2016/5/10/chartex" xmlns:cx5="http://schemas.microsoft.com/office/drawing/2016/5/11/chartex" xmlns:cx6="http://schemas.microsoft.com/office/drawing/2016/5/12/chartex" xmlns:cx7="http://schemas.microsoft.com/office/drawing/2016/5/13/chartex" xmlns:cx8="http://schemas.microsoft.com/office/drawing/2016/5/14/chartex" xmlns:mc="http://schemas.openxmlformats.org/markup-compatibility/2006" xmlns:m="http://schemas.openxmlformats.org/officeDocument/2006/math" xmlns:aink="http://schemas.microsoft.com/office/drawing/2016/ink" xmlns:am3d="http://schemas.microsoft.com/office/drawing/2017/model3d" xmlns:oel="http://schemas.microsoft.com/office/2019/extlst" xmlns:r="http://schemas.openxmlformats.org/officeDocument/2006/relationships" xmlns:wp14="http://schemas.microsoft.com/office/word/2010/wordprocessingDrawing" xmlns:wp="http://schemas.openxmlformats.org/drawingml/2006/wordprocessingDrawing" xmlns:wpg="http://schemas.microsoft.com/office/word/2010/wordprocessingGroup" xmlns:wpi="http://schemas.microsoft.com/office/word/2010/wordprocessingInk" xmlns:wps="http://schemas.microsoft.com/office/word/2010/wordprocessingShape" xmlns:o="urn:schemas-microsoft-com:office:office" xmlns:v="urn:schemas-microsoft-com:vml" xmlns:w10="urn:schemas-microsoft-com:office:word" xmlns:w="http://schemas.openxmlformats.org/wordprocessingml/2006/main" xmlns:w14="http://schemas.microsoft.com/office/word/2010/wordml" xmlns:w15="http://schemas.microsoft.com/office/word/2012/wordml" xmlns:w16cex="http://schemas.microsoft.com/office/word/2018/wordml/cex" xmlns:w16cid="http://schemas.microsoft.com/office/word/2016/wordml/cid" xmlns:w16="http://schemas.microsoft.com/office/word/2018/wordml" xmlns:w16sdtdh="http://schemas.microsoft.com/office/word/2020/wordml/sdtdatahash" xmlns:w16sdtfl="http://schemas.microsoft.com/office/word/2024/wordml/sdtformatlock" xmlns:w16se="http://schemas.microsoft.com/office/word/2015/wordml/symex" xmlns:w16du="http://schemas.microsoft.com/office/word/2023/wordml/word16du" xmlns:wne="http://schemas.microsoft.com/office/word/2006/wordml" mc:Ignorable="w14 w15 w16se w16cid w16 w16cex w16sdtdh w16sdtfl w16du wp14">
   <w:sdt>
     <w:sdtPr>
       <w:rPr>
@@ -6137,7 +6140,7 @@
 </file>
 
 <file path=word/footnotes.xml><?xml version="1.0" encoding="utf-8"?>
-<w:footnotes xmlns:wpc="http://schemas.microsoft.com/office/word/2010/wordprocessingCanvas" xmlns:cx="http://schemas.microsoft.com/office/drawing/2014/chartex" xmlns:cx1="http://schemas.microsoft.com/office/drawing/2015/9/8/chartex" xmlns:cx2="http://schemas.microsoft.com/office/drawing/2015/10/21/chartex" xmlns:cx3="http://schemas.microsoft.com/office/drawing/2016/5/9/chartex" xmlns:cx4="http://schemas.microsoft.com/office/drawing/2016/5/10/chartex" xmlns:cx5="http://schemas.microsoft.com/office/drawing/2016/5/11/chartex" xmlns:cx6="http://schemas.microsoft.com/office/drawing/2016/5/12/chartex" xmlns:cx7="http://schemas.microsoft.com/office/drawing/2016/5/13/chartex" xmlns:cx8="http://schemas.microsoft.com/office/drawing/2016/5/14/chartex" xmlns:mc="http://schemas.openxmlformats.org/markup-compatibility/2006" xmlns:aink="http://schemas.microsoft.com/office/drawing/2016/ink" xmlns:am3d="http://schemas.microsoft.com/office/drawing/2017/model3d" xmlns:o="urn:schemas-microsoft-com:office:office" xmlns:oel="http://schemas.microsoft.com/office/2019/extlst" xmlns:r="http://schemas.openxmlformats.org/officeDocument/2006/relationships" xmlns:m="http://schemas.openxmlformats.org/officeDocument/2006/math" xmlns:v="urn:schemas-microsoft-com:vml" xmlns:wp14="http://schemas.microsoft.com/office/word/2010/wordprocessingDrawing" xmlns:wp="http://schemas.openxmlformats.org/drawingml/2006/wordprocessingDrawing" xmlns:w10="urn:schemas-microsoft-com:office:word" xmlns:w="http://schemas.openxmlformats.org/wordprocessingml/2006/main" xmlns:w14="http://schemas.microsoft.com/office/word/2010/wordml" xmlns:w15="http://schemas.microsoft.com/office/word/2012/wordml" xmlns:w16cex="http://schemas.microsoft.com/office/word/2018/wordml/cex" xmlns:w16cid="http://schemas.microsoft.com/office/word/2016/wordml/cid" xmlns:w16="http://schemas.microsoft.com/office/word/2018/wordml" xmlns:w16du="http://schemas.microsoft.com/office/word/2023/wordml/word16du" xmlns:w16sdtdh="http://schemas.microsoft.com/office/word/2020/wordml/sdtdatahash" xmlns:w16sdtfl="http://schemas.microsoft.com/office/word/2024/wordml/sdtformatlock" xmlns:w16se="http://schemas.microsoft.com/office/word/2015/wordml/symex" xmlns:wpg="http://schemas.microsoft.com/office/word/2010/wordprocessingGroup" xmlns:wpi="http://schemas.microsoft.com/office/word/2010/wordprocessingInk" xmlns:wne="http://schemas.microsoft.com/office/word/2006/wordml" xmlns:wps="http://schemas.microsoft.com/office/word/2010/wordprocessingShape" mc:Ignorable="w14 w15 w16se w16cid w16 w16cex w16sdtdh w16sdtfl w16du wp14">
+<w:footnotes xmlns:wpc="http://schemas.microsoft.com/office/word/2010/wordprocessingCanvas" xmlns:cx="http://schemas.microsoft.com/office/drawing/2014/chartex" xmlns:cx1="http://schemas.microsoft.com/office/drawing/2015/9/8/chartex" xmlns:cx2="http://schemas.microsoft.com/office/drawing/2015/10/21/chartex" xmlns:cx3="http://schemas.microsoft.com/office/drawing/2016/5/9/chartex" xmlns:cx4="http://schemas.microsoft.com/office/drawing/2016/5/10/chartex" xmlns:cx5="http://schemas.microsoft.com/office/drawing/2016/5/11/chartex" xmlns:cx6="http://schemas.microsoft.com/office/drawing/2016/5/12/chartex" xmlns:cx7="http://schemas.microsoft.com/office/drawing/2016/5/13/chartex" xmlns:cx8="http://schemas.microsoft.com/office/drawing/2016/5/14/chartex" xmlns:mc="http://schemas.openxmlformats.org/markup-compatibility/2006" xmlns:m="http://schemas.openxmlformats.org/officeDocument/2006/math" xmlns:aink="http://schemas.microsoft.com/office/drawing/2016/ink" xmlns:am3d="http://schemas.microsoft.com/office/drawing/2017/model3d" xmlns:oel="http://schemas.microsoft.com/office/2019/extlst" xmlns:r="http://schemas.openxmlformats.org/officeDocument/2006/relationships" xmlns:wp14="http://schemas.microsoft.com/office/word/2010/wordprocessingDrawing" xmlns:wp="http://schemas.openxmlformats.org/drawingml/2006/wordprocessingDrawing" xmlns:wpg="http://schemas.microsoft.com/office/word/2010/wordprocessingGroup" xmlns:wpi="http://schemas.microsoft.com/office/word/2010/wordprocessingInk" xmlns:wps="http://schemas.microsoft.com/office/word/2010/wordprocessingShape" xmlns:o="urn:schemas-microsoft-com:office:office" xmlns:v="urn:schemas-microsoft-com:vml" xmlns:w10="urn:schemas-microsoft-com:office:word" xmlns:w="http://schemas.openxmlformats.org/wordprocessingml/2006/main" xmlns:w14="http://schemas.microsoft.com/office/word/2010/wordml" xmlns:w15="http://schemas.microsoft.com/office/word/2012/wordml" xmlns:w16cex="http://schemas.microsoft.com/office/word/2018/wordml/cex" xmlns:w16cid="http://schemas.microsoft.com/office/word/2016/wordml/cid" xmlns:w16="http://schemas.microsoft.com/office/word/2018/wordml" xmlns:w16sdtdh="http://schemas.microsoft.com/office/word/2020/wordml/sdtdatahash" xmlns:w16sdtfl="http://schemas.microsoft.com/office/word/2024/wordml/sdtformatlock" xmlns:w16se="http://schemas.microsoft.com/office/word/2015/wordml/symex" xmlns:w16du="http://schemas.microsoft.com/office/word/2023/wordml/word16du" xmlns:wne="http://schemas.microsoft.com/office/word/2006/wordml" mc:Ignorable="w14 w15 w16se w16cid w16 w16cex w16sdtdh w16sdtfl w16du wp14">
   <w:footnote w:type="separator" w:id="-1">
     <w:p>
       <w:r>
@@ -6158,7 +6161,7 @@
         <w:pStyle w:val="FootnoteText"/>
         <w:rPr>
           <w:rFonts w:asciiTheme="majorHAnsi" w:hAnsiTheme="majorHAnsi" w:cstheme="majorHAnsi"/>
-          <w:lang w:val="en-GB"/>
+          <w:lang w:val="es-ES"/>
         </w:rPr>
       </w:pPr>
       <w:r>
@@ -6179,7 +6182,7 @@
           <w:rPr>
             <w:rStyle w:val="Hyperlink"/>
             <w:rFonts w:asciiTheme="majorHAnsi" w:hAnsiTheme="majorHAnsi" w:cstheme="majorHAnsi"/>
-            <w:lang w:val="en-GB"/>
+            <w:lang w:val="es-ES"/>
           </w:rPr>
           <w:t>Lakoff &amp; Johnson (1980)</w:t>
         </w:r>
@@ -6187,7 +6190,7 @@
       <w:r>
         <w:rPr>
           <w:rFonts w:asciiTheme="majorHAnsi" w:hAnsiTheme="majorHAnsi" w:cstheme="majorHAnsi"/>
-          <w:lang w:val="en-GB"/>
+          <w:lang w:val="es-ES"/>
         </w:rPr>
         <w:t>.</w:t>
       </w:r>
@@ -6376,7 +6379,7 @@
 </file>
 
 <file path=word/numbering.xml><?xml version="1.0" encoding="utf-8"?>
-<w:numbering xmlns:wpc="http://schemas.microsoft.com/office/word/2010/wordprocessingCanvas" xmlns:cx="http://schemas.microsoft.com/office/drawing/2014/chartex" xmlns:cx1="http://schemas.microsoft.com/office/drawing/2015/9/8/chartex" xmlns:cx2="http://schemas.microsoft.com/office/drawing/2015/10/21/chartex" xmlns:cx3="http://schemas.microsoft.com/office/drawing/2016/5/9/chartex" xmlns:cx4="http://schemas.microsoft.com/office/drawing/2016/5/10/chartex" xmlns:cx5="http://schemas.microsoft.com/office/drawing/2016/5/11/chartex" xmlns:cx6="http://schemas.microsoft.com/office/drawing/2016/5/12/chartex" xmlns:cx7="http://schemas.microsoft.com/office/drawing/2016/5/13/chartex" xmlns:cx8="http://schemas.microsoft.com/office/drawing/2016/5/14/chartex" xmlns:mc="http://schemas.openxmlformats.org/markup-compatibility/2006" xmlns:aink="http://schemas.microsoft.com/office/drawing/2016/ink" xmlns:am3d="http://schemas.microsoft.com/office/drawing/2017/model3d" xmlns:o="urn:schemas-microsoft-com:office:office" xmlns:oel="http://schemas.microsoft.com/office/2019/extlst" xmlns:r="http://schemas.openxmlformats.org/officeDocument/2006/relationships" xmlns:m="http://schemas.openxmlformats.org/officeDocument/2006/math" xmlns:v="urn:schemas-microsoft-com:vml" xmlns:wp14="http://schemas.microsoft.com/office/word/2010/wordprocessingDrawing" xmlns:wp="http://schemas.openxmlformats.org/drawingml/2006/wordprocessingDrawing" xmlns:w10="urn:schemas-microsoft-com:office:word" xmlns:w="http://schemas.openxmlformats.org/wordprocessingml/2006/main" xmlns:w14="http://schemas.microsoft.com/office/word/2010/wordml" xmlns:w15="http://schemas.microsoft.com/office/word/2012/wordml" xmlns:w16cex="http://schemas.microsoft.com/office/word/2018/wordml/cex" xmlns:w16cid="http://schemas.microsoft.com/office/word/2016/wordml/cid" xmlns:w16="http://schemas.microsoft.com/office/word/2018/wordml" xmlns:w16du="http://schemas.microsoft.com/office/word/2023/wordml/word16du" xmlns:w16sdtdh="http://schemas.microsoft.com/office/word/2020/wordml/sdtdatahash" xmlns:w16sdtfl="http://schemas.microsoft.com/office/word/2024/wordml/sdtformatlock" xmlns:w16se="http://schemas.microsoft.com/office/word/2015/wordml/symex" xmlns:wpg="http://schemas.microsoft.com/office/word/2010/wordprocessingGroup" xmlns:wpi="http://schemas.microsoft.com/office/word/2010/wordprocessingInk" xmlns:wne="http://schemas.microsoft.com/office/word/2006/wordml" xmlns:wps="http://schemas.microsoft.com/office/word/2010/wordprocessingShape" mc:Ignorable="w14 w15 w16se w16cid w16 w16cex w16sdtdh w16sdtfl w16du wp14">
+<w:numbering xmlns:wpc="http://schemas.microsoft.com/office/word/2010/wordprocessingCanvas" xmlns:cx="http://schemas.microsoft.com/office/drawing/2014/chartex" xmlns:cx1="http://schemas.microsoft.com/office/drawing/2015/9/8/chartex" xmlns:cx2="http://schemas.microsoft.com/office/drawing/2015/10/21/chartex" xmlns:cx3="http://schemas.microsoft.com/office/drawing/2016/5/9/chartex" xmlns:cx4="http://schemas.microsoft.com/office/drawing/2016/5/10/chartex" xmlns:cx5="http://schemas.microsoft.com/office/drawing/2016/5/11/chartex" xmlns:cx6="http://schemas.microsoft.com/office/drawing/2016/5/12/chartex" xmlns:cx7="http://schemas.microsoft.com/office/drawing/2016/5/13/chartex" xmlns:cx8="http://schemas.microsoft.com/office/drawing/2016/5/14/chartex" xmlns:mc="http://schemas.openxmlformats.org/markup-compatibility/2006" xmlns:m="http://schemas.openxmlformats.org/officeDocument/2006/math" xmlns:aink="http://schemas.microsoft.com/office/drawing/2016/ink" xmlns:am3d="http://schemas.microsoft.com/office/drawing/2017/model3d" xmlns:oel="http://schemas.microsoft.com/office/2019/extlst" xmlns:r="http://schemas.openxmlformats.org/officeDocument/2006/relationships" xmlns:wp14="http://schemas.microsoft.com/office/word/2010/wordprocessingDrawing" xmlns:wp="http://schemas.openxmlformats.org/drawingml/2006/wordprocessingDrawing" xmlns:wpg="http://schemas.microsoft.com/office/word/2010/wordprocessingGroup" xmlns:wpi="http://schemas.microsoft.com/office/word/2010/wordprocessingInk" xmlns:wps="http://schemas.microsoft.com/office/word/2010/wordprocessingShape" xmlns:o="urn:schemas-microsoft-com:office:office" xmlns:v="urn:schemas-microsoft-com:vml" xmlns:w10="urn:schemas-microsoft-com:office:word" xmlns:w="http://schemas.openxmlformats.org/wordprocessingml/2006/main" xmlns:w14="http://schemas.microsoft.com/office/word/2010/wordml" xmlns:w15="http://schemas.microsoft.com/office/word/2012/wordml" xmlns:w16cex="http://schemas.microsoft.com/office/word/2018/wordml/cex" xmlns:w16cid="http://schemas.microsoft.com/office/word/2016/wordml/cid" xmlns:w16="http://schemas.microsoft.com/office/word/2018/wordml" xmlns:w16sdtdh="http://schemas.microsoft.com/office/word/2020/wordml/sdtdatahash" xmlns:w16sdtfl="http://schemas.microsoft.com/office/word/2024/wordml/sdtformatlock" xmlns:w16se="http://schemas.microsoft.com/office/word/2015/wordml/symex" xmlns:w16du="http://schemas.microsoft.com/office/word/2023/wordml/word16du" xmlns:wne="http://schemas.microsoft.com/office/word/2006/wordml" mc:Ignorable="w14 w15 w16se w16cid w16 w16cex w16sdtdh w16sdtfl w16du wp14">
   <w:abstractNum w:abstractNumId="0" w15:restartNumberingAfterBreak="0">
     <w:nsid w:val="FFFFFF7C"/>
     <w:multiLevelType w:val="singleLevel"/>
@@ -7501,7 +7504,7 @@
 </file>
 
 <file path=word/styles.xml><?xml version="1.0" encoding="utf-8"?>
-<w:styles xmlns:mc="http://schemas.openxmlformats.org/markup-compatibility/2006" xmlns:r="http://schemas.openxmlformats.org/officeDocument/2006/relationships" xmlns:w="http://schemas.openxmlformats.org/wordprocessingml/2006/main" xmlns:w14="http://schemas.microsoft.com/office/word/2010/wordml" xmlns:w15="http://schemas.microsoft.com/office/word/2012/wordml" xmlns:w16cex="http://schemas.microsoft.com/office/word/2018/wordml/cex" xmlns:w16cid="http://schemas.microsoft.com/office/word/2016/wordml/cid" xmlns:w16="http://schemas.microsoft.com/office/word/2018/wordml" xmlns:w16du="http://schemas.microsoft.com/office/word/2023/wordml/word16du" xmlns:w16sdtdh="http://schemas.microsoft.com/office/word/2020/wordml/sdtdatahash" xmlns:w16sdtfl="http://schemas.microsoft.com/office/word/2024/wordml/sdtformatlock" xmlns:w16se="http://schemas.microsoft.com/office/word/2015/wordml/symex" mc:Ignorable="w14 w15 w16se w16cid w16 w16cex w16sdtdh w16sdtfl w16du">
+<w:styles xmlns:mc="http://schemas.openxmlformats.org/markup-compatibility/2006" xmlns:r="http://schemas.openxmlformats.org/officeDocument/2006/relationships" xmlns:w="http://schemas.openxmlformats.org/wordprocessingml/2006/main" xmlns:w14="http://schemas.microsoft.com/office/word/2010/wordml" xmlns:w15="http://schemas.microsoft.com/office/word/2012/wordml" xmlns:w16cex="http://schemas.microsoft.com/office/word/2018/wordml/cex" xmlns:w16cid="http://schemas.microsoft.com/office/word/2016/wordml/cid" xmlns:w16="http://schemas.microsoft.com/office/word/2018/wordml" xmlns:w16sdtdh="http://schemas.microsoft.com/office/word/2020/wordml/sdtdatahash" xmlns:w16sdtfl="http://schemas.microsoft.com/office/word/2024/wordml/sdtformatlock" xmlns:w16se="http://schemas.microsoft.com/office/word/2015/wordml/symex" xmlns:w16du="http://schemas.microsoft.com/office/word/2023/wordml/word16du" mc:Ignorable="w14 w15 w16se w16cid w16 w16cex w16sdtdh w16sdtfl w16du">
   <w:docDefaults>
     <w:rPrDefault>
       <w:rPr>

</xml_diff>